<commit_message>
Remove R Markdown, trim report cover and add redesigned research figures
</commit_message>
<xml_diff>
--- a/research/report/quetta-labor-force-report.docx
+++ b/research/report/quetta-labor-force-report.docx
@@ -2,314 +2,6 @@
 <file path=word/document.xml><?xml version="1.0" encoding="utf-8"?>
 <w:document xmlns:wpc="http://schemas.microsoft.com/office/word/2010/wordprocessingCanvas" xmlns:cx="http://schemas.microsoft.com/office/drawing/2014/chartex" xmlns:cx1="http://schemas.microsoft.com/office/drawing/2015/9/8/chartex" xmlns:cx2="http://schemas.microsoft.com/office/drawing/2015/10/21/chartex" xmlns:cx3="http://schemas.microsoft.com/office/drawing/2016/5/9/chartex" xmlns:cx4="http://schemas.microsoft.com/office/drawing/2016/5/10/chartex" xmlns:cx5="http://schemas.microsoft.com/office/drawing/2016/5/11/chartex" xmlns:cx6="http://schemas.microsoft.com/office/drawing/2016/5/12/chartex" xmlns:cx7="http://schemas.microsoft.com/office/drawing/2016/5/13/chartex" xmlns:cx8="http://schemas.microsoft.com/office/drawing/2016/5/14/chartex" xmlns:mc="http://schemas.openxmlformats.org/markup-compatibility/2006" xmlns:aink="http://schemas.microsoft.com/office/drawing/2016/ink" xmlns:am3d="http://schemas.microsoft.com/office/drawing/2017/model3d" xmlns:o="urn:schemas-microsoft-com:office:office" xmlns:oel="http://schemas.microsoft.com/office/2019/extlst" xmlns:r="http://schemas.openxmlformats.org/officeDocument/2006/relationships" xmlns:m="http://schemas.openxmlformats.org/officeDocument/2006/math" xmlns:v="urn:schemas-microsoft-com:vml" xmlns:wp14="http://schemas.microsoft.com/office/word/2010/wordprocessingDrawing" xmlns:wp="http://schemas.openxmlformats.org/drawingml/2006/wordprocessingDrawing" xmlns:w10="urn:schemas-microsoft-com:office:word" xmlns:w="http://schemas.openxmlformats.org/wordprocessingml/2006/main" xmlns:w14="http://schemas.microsoft.com/office/word/2010/wordml" xmlns:w15="http://schemas.microsoft.com/office/word/2012/wordml" xmlns:w16cex="http://schemas.microsoft.com/office/word/2018/wordml/cex" xmlns:w16cid="http://schemas.microsoft.com/office/word/2016/wordml/cid" xmlns:w16="http://schemas.microsoft.com/office/word/2018/wordml" xmlns:w16du="http://schemas.microsoft.com/office/word/2023/wordml/word16du" xmlns:w16sdtdh="http://schemas.microsoft.com/office/word/2020/wordml/sdtdatahash" xmlns:w16sdtfl="http://schemas.microsoft.com/office/word/2024/wordml/sdtformatlock" xmlns:w16se="http://schemas.microsoft.com/office/word/2015/wordml/symex" xmlns:wpg="http://schemas.microsoft.com/office/word/2010/wordprocessingGroup" xmlns:wpi="http://schemas.microsoft.com/office/word/2010/wordprocessingInk" xmlns:wne="http://schemas.microsoft.com/office/word/2006/wordml" xmlns:wps="http://schemas.microsoft.com/office/word/2010/wordprocessingShape" mc:Ignorable="w14 w15 w16se w16cid w16 w16cex w16sdtdh w16sdtfl w16du wp14">
   <w:body>
-    <w:p>
-      <w:pPr>
-        <w:spacing w:before="100" w:beforeAutospacing="1" w:after="100" w:afterAutospacing="1" w:line="276" w:lineRule="auto"/>
-        <w:jc w:val="both"/>
-        <w:outlineLvl w:val="0"/>
-        <w:rPr>
-          <w:rFonts w:asciiTheme="majorBidi" w:eastAsia="Times New Roman" w:hAnsiTheme="majorBidi" w:cstheme="majorBidi"/>
-          <w:kern w:val="36"/>
-          <w:lang w:eastAsia="en-GB"/>
-          <w14:ligatures w14:val="none"/>
-        </w:rPr>
-      </w:pPr>
-      <w:bookmarkStart w:id="0" w:name="_Hlk216647149"/>
-      <w:bookmarkEnd w:id="0"/>
-    </w:p>
-    <w:p>
-      <w:pPr>
-        <w:spacing w:before="100" w:beforeAutospacing="1" w:after="100" w:afterAutospacing="1" w:line="276" w:lineRule="auto"/>
-        <w:jc w:val="both"/>
-        <w:outlineLvl w:val="0"/>
-        <w:rPr>
-          <w:rFonts w:asciiTheme="majorBidi" w:eastAsia="Times New Roman" w:hAnsiTheme="majorBidi" w:cstheme="majorBidi"/>
-          <w:kern w:val="36"/>
-          <w:lang w:eastAsia="en-GB"/>
-          <w14:ligatures w14:val="none"/>
-        </w:rPr>
-      </w:pPr>
-    </w:p>
-    <w:p>
-      <w:pPr>
-        <w:spacing w:before="100" w:beforeAutospacing="1" w:after="100" w:afterAutospacing="1" w:line="276" w:lineRule="auto"/>
-        <w:jc w:val="both"/>
-        <w:outlineLvl w:val="0"/>
-        <w:rPr>
-          <w:rFonts w:asciiTheme="majorBidi" w:eastAsia="Times New Roman" w:hAnsiTheme="majorBidi" w:cstheme="majorBidi"/>
-          <w:kern w:val="36"/>
-          <w:lang w:eastAsia="en-GB"/>
-          <w14:ligatures w14:val="none"/>
-        </w:rPr>
-      </w:pPr>
-      <w:r>
-        <w:rPr>
-          <w:noProof/>
-          <w:sz w:val="20"/>
-        </w:rPr>
-        <w:drawing>
-          <wp:anchor distT="0" distB="0" distL="114300" distR="114300" simplePos="0" relativeHeight="251695104" behindDoc="0" locked="0" layoutInCell="1" allowOverlap="1" wp14:anchorId="16719CC8" wp14:editId="081407C6">
-            <wp:simplePos x="0" y="0"/>
-            <wp:positionH relativeFrom="margin">
-              <wp:align>center</wp:align>
-            </wp:positionH>
-            <wp:positionV relativeFrom="paragraph">
-              <wp:posOffset>308610</wp:posOffset>
-            </wp:positionV>
-            <wp:extent cx="3413125" cy="2943860"/>
-            <wp:effectExtent l="0" t="0" r="0" b="8890"/>
-            <wp:wrapTopAndBottom/>
-            <wp:docPr id="1" name="Image 1"/>
-            <wp:cNvGraphicFramePr>
-              <a:graphicFrameLocks xmlns:a="http://schemas.openxmlformats.org/drawingml/2006/main"/>
-            </wp:cNvGraphicFramePr>
-            <a:graphic xmlns:a="http://schemas.openxmlformats.org/drawingml/2006/main">
-              <a:graphicData uri="http://schemas.openxmlformats.org/drawingml/2006/picture">
-                <pic:pic xmlns:pic="http://schemas.openxmlformats.org/drawingml/2006/picture">
-                  <pic:nvPicPr>
-                    <pic:cNvPr id="1" name="Image 1"/>
-                    <pic:cNvPicPr/>
-                  </pic:nvPicPr>
-                  <pic:blipFill>
-                    <a:blip r:embed="rId6" cstate="print">
-                      <a:extLst>
-                        <a:ext uri="{28A0092B-C50C-407E-A947-70E740481C1C}">
-                          <a14:useLocalDpi xmlns:a14="http://schemas.microsoft.com/office/drawing/2010/main" val="0"/>
-                        </a:ext>
-                      </a:extLst>
-                    </a:blip>
-                    <a:stretch>
-                      <a:fillRect/>
-                    </a:stretch>
-                  </pic:blipFill>
-                  <pic:spPr>
-                    <a:xfrm>
-                      <a:off x="0" y="0"/>
-                      <a:ext cx="3413125" cy="2943860"/>
-                    </a:xfrm>
-                    <a:prstGeom prst="rect">
-                      <a:avLst/>
-                    </a:prstGeom>
-                  </pic:spPr>
-                </pic:pic>
-              </a:graphicData>
-            </a:graphic>
-          </wp:anchor>
-        </w:drawing>
-      </w:r>
-    </w:p>
-    <w:p>
-      <w:pPr>
-        <w:spacing w:before="100" w:beforeAutospacing="1" w:after="100" w:afterAutospacing="1" w:line="240" w:lineRule="auto"/>
-        <w:jc w:val="center"/>
-        <w:rPr>
-          <w:rFonts w:ascii="Times New Roman" w:eastAsia="Times New Roman" w:hAnsi="Times New Roman" w:cs="Times New Roman"/>
-          <w:b/>
-          <w:bCs/>
-          <w:kern w:val="0"/>
-          <w:sz w:val="28"/>
-          <w:szCs w:val="28"/>
-          <w14:ligatures w14:val="none"/>
-        </w:rPr>
-      </w:pPr>
-    </w:p>
-    <w:p>
-      <w:pPr>
-        <w:spacing w:before="100" w:beforeAutospacing="1" w:after="100" w:afterAutospacing="1" w:line="240" w:lineRule="auto"/>
-        <w:jc w:val="center"/>
-        <w:rPr>
-          <w:rFonts w:ascii="Times New Roman" w:eastAsia="Times New Roman" w:hAnsi="Times New Roman" w:cs="Times New Roman"/>
-          <w:b/>
-          <w:bCs/>
-          <w:kern w:val="0"/>
-          <w:sz w:val="48"/>
-          <w:szCs w:val="48"/>
-          <w14:ligatures w14:val="none"/>
-        </w:rPr>
-      </w:pPr>
-      <w:r>
-        <w:t>Labor Force Structure in Quetta Division</w:t>
-      </w:r>
-    </w:p>
-    <w:p>
-      <w:pPr>
-        <w:spacing w:before="100" w:beforeAutospacing="1" w:after="100" w:afterAutospacing="1" w:line="240" w:lineRule="auto"/>
-        <w:jc w:val="center"/>
-        <w:rPr>
-          <w:rFonts w:ascii="Times New Roman" w:eastAsia="Times New Roman" w:hAnsi="Times New Roman" w:cs="Times New Roman"/>
-          <w:b/>
-          <w:bCs/>
-          <w:kern w:val="0"/>
-          <w:sz w:val="28"/>
-          <w:szCs w:val="28"/>
-          <w14:ligatures w14:val="none"/>
-        </w:rPr>
-      </w:pPr>
-      <w:r>
-        <w:t>Research study: Analysing the Structure of the Labor Force</w:t>
-        <w:br/>
-        <w:t>Division = Quetta</w:t>
-      </w:r>
-    </w:p>
-    <w:p>
-      <w:pPr>
-        <w:spacing w:after="0" w:line="240" w:lineRule="auto"/>
-        <w:jc w:val="center"/>
-        <w:rPr>
-          <w:rFonts w:asciiTheme="majorBidi" w:hAnsiTheme="majorBidi" w:cstheme="majorBidi"/>
-          <w:b/>
-          <w:bCs/>
-          <w:sz w:val="28"/>
-          <w:szCs w:val="28"/>
-        </w:rPr>
-      </w:pPr>
-      <w:r>
-        <w:rPr>
-          <w:rFonts w:asciiTheme="majorBidi" w:hAnsiTheme="majorBidi" w:cstheme="majorBidi"/>
-          <w:b/>
-          <w:bCs/>
-          <w:sz w:val="28"/>
-          <w:szCs w:val="28"/>
-        </w:rPr>
-        <w:t>NAME: Syeda Mariam Naqvi</w:t>
-      </w:r>
-    </w:p>
-    <w:p>
-      <w:pPr>
-        <w:spacing w:after="0" w:line="240" w:lineRule="auto"/>
-        <w:jc w:val="center"/>
-        <w:rPr>
-          <w:rFonts w:asciiTheme="majorBidi" w:hAnsiTheme="majorBidi" w:cstheme="majorBidi"/>
-          <w:b/>
-          <w:bCs/>
-          <w:sz w:val="28"/>
-          <w:szCs w:val="28"/>
-        </w:rPr>
-      </w:pPr>
-      <w:r>
-        <w:t>Independent Research | LFS 2020–21</w:t>
-      </w:r>
-    </w:p>
-    <w:p>
-      <w:pPr>
-        <w:spacing w:before="100" w:beforeAutospacing="1" w:after="100" w:afterAutospacing="1" w:line="240" w:lineRule="auto"/>
-        <w:jc w:val="center"/>
-        <w:rPr>
-          <w:rFonts w:ascii="Times New Roman" w:eastAsia="Times New Roman" w:hAnsi="Times New Roman" w:cs="Times New Roman"/>
-          <w:b/>
-          <w:bCs/>
-          <w:kern w:val="0"/>
-          <w:sz w:val="28"/>
-          <w:szCs w:val="28"/>
-          <w14:ligatures w14:val="none"/>
-        </w:rPr>
-      </w:pPr>
-    </w:p>
-    <w:p>
-      <w:pPr>
-        <w:spacing w:before="100" w:beforeAutospacing="1" w:after="100" w:afterAutospacing="1" w:line="240" w:lineRule="auto"/>
-        <w:jc w:val="center"/>
-        <w:rPr>
-          <w:rFonts w:ascii="Times New Roman" w:eastAsia="Times New Roman" w:hAnsi="Times New Roman" w:cs="Times New Roman"/>
-          <w:b/>
-          <w:bCs/>
-          <w:kern w:val="0"/>
-          <w:sz w:val="28"/>
-          <w:szCs w:val="28"/>
-          <w14:ligatures w14:val="none"/>
-        </w:rPr>
-      </w:pPr>
-    </w:p>
-    <w:p>
-      <w:pPr>
-        <w:spacing w:before="100" w:beforeAutospacing="1" w:after="100" w:afterAutospacing="1" w:line="240" w:lineRule="auto"/>
-        <w:jc w:val="center"/>
-        <w:rPr>
-          <w:rFonts w:ascii="Times New Roman" w:eastAsia="Times New Roman" w:hAnsi="Times New Roman" w:cs="Times New Roman"/>
-          <w:b/>
-          <w:bCs/>
-          <w:kern w:val="0"/>
-          <w:sz w:val="28"/>
-          <w:szCs w:val="28"/>
-          <w14:ligatures w14:val="none"/>
-        </w:rPr>
-      </w:pPr>
-    </w:p>
-    <w:p>
-      <w:pPr>
-        <w:spacing w:before="100" w:beforeAutospacing="1" w:after="100" w:afterAutospacing="1" w:line="240" w:lineRule="auto"/>
-        <w:jc w:val="center"/>
-        <w:rPr>
-          <w:rFonts w:ascii="Times New Roman" w:eastAsia="Times New Roman" w:hAnsi="Times New Roman" w:cs="Times New Roman"/>
-          <w:b/>
-          <w:bCs/>
-          <w:kern w:val="0"/>
-          <w:sz w:val="28"/>
-          <w:szCs w:val="28"/>
-          <w14:ligatures w14:val="none"/>
-        </w:rPr>
-      </w:pPr>
-    </w:p>
-    <w:p>
-      <w:pPr>
-        <w:spacing w:before="100" w:beforeAutospacing="1" w:after="100" w:afterAutospacing="1" w:line="240" w:lineRule="auto"/>
-        <w:jc w:val="center"/>
-        <w:rPr>
-          <w:rFonts w:ascii="Times New Roman" w:eastAsia="Times New Roman" w:hAnsi="Times New Roman" w:cs="Times New Roman"/>
-          <w:b/>
-          <w:bCs/>
-          <w:kern w:val="0"/>
-          <w:sz w:val="28"/>
-          <w:szCs w:val="28"/>
-          <w14:ligatures w14:val="none"/>
-        </w:rPr>
-      </w:pPr>
-    </w:p>
-    <w:p>
-      <w:pPr>
-        <w:spacing w:before="100" w:beforeAutospacing="1" w:after="100" w:afterAutospacing="1" w:line="240" w:lineRule="auto"/>
-        <w:jc w:val="center"/>
-        <w:rPr>
-          <w:rFonts w:ascii="Times New Roman" w:eastAsia="Times New Roman" w:hAnsi="Times New Roman" w:cs="Times New Roman"/>
-          <w:b/>
-          <w:bCs/>
-          <w:kern w:val="0"/>
-          <w:sz w:val="28"/>
-          <w:szCs w:val="28"/>
-          <w14:ligatures w14:val="none"/>
-        </w:rPr>
-      </w:pPr>
-    </w:p>
-    <w:p>
-      <w:pPr>
-        <w:spacing w:before="100" w:beforeAutospacing="1" w:after="100" w:afterAutospacing="1" w:line="240" w:lineRule="auto"/>
-        <w:jc w:val="center"/>
-        <w:rPr>
-          <w:rFonts w:ascii="Times New Roman" w:eastAsia="Times New Roman" w:hAnsi="Times New Roman" w:cs="Times New Roman"/>
-          <w:b/>
-          <w:bCs/>
-          <w:kern w:val="0"/>
-          <w:sz w:val="28"/>
-          <w:szCs w:val="28"/>
-          <w14:ligatures w14:val="none"/>
-        </w:rPr>
-      </w:pPr>
-    </w:p>
-    <w:p>
-      <w:pPr>
-        <w:spacing w:before="100" w:beforeAutospacing="1" w:after="100" w:afterAutospacing="1" w:line="240" w:lineRule="auto"/>
-        <w:jc w:val="center"/>
-        <w:rPr>
-          <w:rFonts w:ascii="Times New Roman" w:eastAsia="Times New Roman" w:hAnsi="Times New Roman" w:cs="Times New Roman"/>
-          <w:b/>
-          <w:bCs/>
-          <w:kern w:val="0"/>
-          <w:sz w:val="28"/>
-          <w:szCs w:val="28"/>
-          <w14:ligatures w14:val="none"/>
-        </w:rPr>
-      </w:pPr>
-    </w:p>
     <w:p>
       <w:pPr>
         <w:spacing w:before="100" w:beforeAutospacing="1" w:after="100" w:afterAutospacing="1" w:line="276" w:lineRule="auto"/>
@@ -9800,6 +9492,156 @@
           <w14:ligatures w14:val="none"/>
         </w:rPr>
       </w:pPr>
+    </w:p>
+    <w:p>
+      <w:r>
+        <w:br w:type="page"/>
+      </w:r>
+    </w:p>
+    <w:p>
+      <w:pPr>
+        <w:pStyle w:val="Heading1"/>
+      </w:pPr>
+      <w:r>
+        <w:t>Supplementary figures: recomputed descriptive comparisons</w:t>
+      </w:r>
+    </w:p>
+    <w:p>
+      <w:r>
+        <w:t>The following figures were recomputed from the uploaded Quetta extract. They complement the original report; source attribution is under clarification because the author identifies World Bank WDI while the uploaded materials identify LFS 2020–21.</w:t>
+      </w:r>
+    </w:p>
+    <w:p>
+      <w:pPr>
+        <w:pStyle w:val="Heading2"/>
+      </w:pPr>
+      <w:r>
+        <w:t>Economic activity by age</w:t>
+      </w:r>
+    </w:p>
+    <w:p>
+      <w:r>
+        <w:drawing>
+          <wp:inline xmlns:a="http://schemas.openxmlformats.org/drawingml/2006/main" xmlns:pic="http://schemas.openxmlformats.org/drawingml/2006/picture">
+            <wp:extent cx="5486400" cy="2904565"/>
+            <wp:docPr id="2049989112" name="Picture 2049989112"/>
+            <wp:cNvGraphicFramePr>
+              <a:graphicFrameLocks noChangeAspect="1"/>
+            </wp:cNvGraphicFramePr>
+            <a:graphic>
+              <a:graphicData uri="http://schemas.openxmlformats.org/drawingml/2006/picture">
+                <pic:pic>
+                  <pic:nvPicPr>
+                    <pic:cNvPr id="0" name="economic-activity.png"/>
+                    <pic:cNvPicPr/>
+                  </pic:nvPicPr>
+                  <pic:blipFill>
+                    <a:blip r:embed="rId43"/>
+                    <a:stretch>
+                      <a:fillRect/>
+                    </a:stretch>
+                  </pic:blipFill>
+                  <pic:spPr>
+                    <a:xfrm>
+                      <a:off x="0" y="0"/>
+                      <a:ext cx="5486400" cy="2904565"/>
+                    </a:xfrm>
+                    <a:prstGeom prst="rect"/>
+                  </pic:spPr>
+                </pic:pic>
+              </a:graphicData>
+            </a:graphic>
+          </wp:inline>
+        </w:drawing>
+      </w:r>
+    </w:p>
+    <w:p>
+      <w:pPr>
+        <w:pStyle w:val="Heading2"/>
+      </w:pPr>
+      <w:r>
+        <w:t>Education by gender</w:t>
+      </w:r>
+    </w:p>
+    <w:p>
+      <w:r>
+        <w:drawing>
+          <wp:inline xmlns:a="http://schemas.openxmlformats.org/drawingml/2006/main" xmlns:pic="http://schemas.openxmlformats.org/drawingml/2006/picture">
+            <wp:extent cx="5486400" cy="2906001"/>
+            <wp:docPr id="2049989113" name="Picture 2049989113"/>
+            <wp:cNvGraphicFramePr>
+              <a:graphicFrameLocks noChangeAspect="1"/>
+            </wp:cNvGraphicFramePr>
+            <a:graphic>
+              <a:graphicData uri="http://schemas.openxmlformats.org/drawingml/2006/picture">
+                <pic:pic>
+                  <pic:nvPicPr>
+                    <pic:cNvPr id="0" name="education.png"/>
+                    <pic:cNvPicPr/>
+                  </pic:nvPicPr>
+                  <pic:blipFill>
+                    <a:blip r:embed="rId44"/>
+                    <a:stretch>
+                      <a:fillRect/>
+                    </a:stretch>
+                  </pic:blipFill>
+                  <pic:spPr>
+                    <a:xfrm>
+                      <a:off x="0" y="0"/>
+                      <a:ext cx="5486400" cy="2906001"/>
+                    </a:xfrm>
+                    <a:prstGeom prst="rect"/>
+                  </pic:spPr>
+                </pic:pic>
+              </a:graphicData>
+            </a:graphic>
+          </wp:inline>
+        </w:drawing>
+      </w:r>
+    </w:p>
+    <w:p>
+      <w:pPr>
+        <w:pStyle w:val="Heading2"/>
+      </w:pPr>
+      <w:r>
+        <w:t>Rural–urban comparison</w:t>
+      </w:r>
+    </w:p>
+    <w:p>
+      <w:r>
+        <w:drawing>
+          <wp:inline xmlns:a="http://schemas.openxmlformats.org/drawingml/2006/main" xmlns:pic="http://schemas.openxmlformats.org/drawingml/2006/picture">
+            <wp:extent cx="5486400" cy="2906001"/>
+            <wp:docPr id="2049989114" name="Picture 2049989114"/>
+            <wp:cNvGraphicFramePr>
+              <a:graphicFrameLocks noChangeAspect="1"/>
+            </wp:cNvGraphicFramePr>
+            <a:graphic>
+              <a:graphicData uri="http://schemas.openxmlformats.org/drawingml/2006/picture">
+                <pic:pic>
+                  <pic:nvPicPr>
+                    <pic:cNvPr id="0" name="settlement.png"/>
+                    <pic:cNvPicPr/>
+                  </pic:nvPicPr>
+                  <pic:blipFill>
+                    <a:blip r:embed="rId45"/>
+                    <a:stretch>
+                      <a:fillRect/>
+                    </a:stretch>
+                  </pic:blipFill>
+                  <pic:spPr>
+                    <a:xfrm>
+                      <a:off x="0" y="0"/>
+                      <a:ext cx="5486400" cy="2906001"/>
+                    </a:xfrm>
+                    <a:prstGeom prst="rect"/>
+                  </pic:spPr>
+                </pic:pic>
+              </a:graphicData>
+            </a:graphic>
+          </wp:inline>
+        </w:drawing>
+      </w:r>
     </w:p>
     <w:sectPr>
       <w:pgSz w:w="11906" w:h="16838"/>

</xml_diff>